<commit_message>
Correcciones del aviso que se genera (Falta agregar el titular)
</commit_message>
<xml_diff>
--- a/SGPla/Archivos/plantillas/aviso.docx
+++ b/SGPla/Archivos/plantillas/aviso.docx
@@ -363,7 +363,27 @@
               <w:sz w:val="20"/>
               <w:szCs w:val="20"/>
             </w:rPr>
-            <w:t>[Region]</w:t>
+            <w:t>[</w:t>
+          </w:r>
+          <w:proofErr w:type="spellStart"/>
+          <w:r>
+            <w:rPr>
+              <w:rFonts w:ascii="Arial" w:hAnsi="Arial" w:cs="Arial"/>
+              <w:bCs/>
+              <w:sz w:val="20"/>
+              <w:szCs w:val="20"/>
+            </w:rPr>
+            <w:t>Region</w:t>
+          </w:r>
+          <w:proofErr w:type="spellEnd"/>
+          <w:r>
+            <w:rPr>
+              <w:rFonts w:ascii="Arial" w:hAnsi="Arial" w:cs="Arial"/>
+              <w:bCs/>
+              <w:sz w:val="20"/>
+              <w:szCs w:val="20"/>
+            </w:rPr>
+            <w:t>]</w:t>
           </w:r>
         </w:sdtContent>
       </w:sdt>
@@ -1284,7 +1304,7 @@
                     <w:bCs/>
                     <w:sz w:val="16"/>
                   </w:rPr>
-                  <w:t xml:space="preserve">   Tipo de Contratación</w:t>
+                  <w:t>Tipo de Contratación</w:t>
                 </w:r>
               </w:p>
             </w:tc>
@@ -1591,14 +1611,6 @@
                     <w:sz w:val="18"/>
                   </w:rPr>
                   <w:t>S</w:t>
-                </w:r>
-                <w:r>
-                  <w:rPr>
-                    <w:rFonts w:ascii="Gill Sans MT" w:hAnsi="Gill Sans MT"/>
-                    <w:b/>
-                    <w:sz w:val="18"/>
-                  </w:rPr>
-                  <w:t>*</w:t>
                 </w:r>
               </w:p>
             </w:tc>
@@ -1949,17 +1961,6 @@
               <w:lang w:val="es-ES"/>
             </w:rPr>
           </w:pPr>
-          <w:r>
-            <w:rPr>
-              <w:rFonts w:ascii="Gill Sans MT" w:hAnsi="Gill Sans MT" w:cs="Times New Roman"/>
-              <w:b/>
-              <w:bCs/>
-              <w:sz w:val="16"/>
-              <w:szCs w:val="16"/>
-              <w:lang w:val="es-ES"/>
-            </w:rPr>
-            <w:t>*SEA, CI</w:t>
-          </w:r>
         </w:p>
         <w:p>
           <w:pPr>
@@ -2789,25 +2790,7 @@
           <w:sz w:val="20"/>
           <w:szCs w:val="20"/>
         </w:rPr>
-        <w:t xml:space="preserve">producción derivada de investigación o creación artística, participación en trabajo </w:t>
-      </w:r>
-      <w:proofErr w:type="spellStart"/>
-      <w:r>
-        <w:rPr>
-          <w:rFonts w:ascii="Arial" w:hAnsi="Arial" w:cs="Arial"/>
-          <w:sz w:val="20"/>
-          <w:szCs w:val="20"/>
-        </w:rPr>
-        <w:t>recepcional</w:t>
-      </w:r>
-      <w:proofErr w:type="spellEnd"/>
-      <w:r>
-        <w:rPr>
-          <w:rFonts w:ascii="Arial" w:hAnsi="Arial" w:cs="Arial"/>
-          <w:sz w:val="20"/>
-          <w:szCs w:val="20"/>
-        </w:rPr>
-        <w:t>, gestión</w:t>
+        <w:t>producción derivada de investigación o creación artística, participación en trabajo recepcional, gestión</w:t>
       </w:r>
       <w:r>
         <w:rPr>
@@ -3511,7 +3494,7 @@
           <w:sz w:val="20"/>
           <w:szCs w:val="20"/>
         </w:rPr>
-        <w:t>, deberán entregar todos los documentos mencionados en los requisitos de participación los días</w:t>
+        <w:t xml:space="preserve">, deberán entregar todos los documentos mencionados en los requisitos de participación </w:t>
       </w:r>
       <w:sdt>
         <w:sdtPr>
@@ -3562,63 +3545,58 @@
           <w:sz w:val="20"/>
           <w:szCs w:val="20"/>
         </w:rPr>
-        <w:t xml:space="preserve">en </w:t>
-      </w:r>
-      <w:r>
-        <w:rPr>
-          <w:rFonts w:ascii="Arial" w:hAnsi="Arial" w:cs="Arial"/>
-          <w:sz w:val="20"/>
-          <w:szCs w:val="20"/>
-        </w:rPr>
-        <w:t xml:space="preserve">el espacio físico que ocupa la Dirección de la </w:t>
-      </w:r>
-      <w:r>
-        <w:rPr>
-          <w:rFonts w:ascii="Arial" w:hAnsi="Arial" w:cs="Arial"/>
-          <w:sz w:val="20"/>
-          <w:szCs w:val="20"/>
-        </w:rPr>
-        <w:t>E</w:t>
-      </w:r>
-      <w:r>
-        <w:rPr>
-          <w:rFonts w:ascii="Arial" w:hAnsi="Arial" w:cs="Arial"/>
-          <w:sz w:val="20"/>
-          <w:szCs w:val="20"/>
-        </w:rPr>
-        <w:t xml:space="preserve">ntidad </w:t>
-      </w:r>
-      <w:r>
-        <w:rPr>
-          <w:rFonts w:ascii="Arial" w:hAnsi="Arial" w:cs="Arial"/>
-          <w:sz w:val="20"/>
-          <w:szCs w:val="20"/>
-        </w:rPr>
-        <w:t>A</w:t>
-      </w:r>
-      <w:r>
-        <w:rPr>
-          <w:rFonts w:ascii="Arial" w:hAnsi="Arial" w:cs="Arial"/>
-          <w:sz w:val="20"/>
-          <w:szCs w:val="20"/>
-        </w:rPr>
-        <w:t>cadémica correspondiente</w:t>
-      </w:r>
-      <w:r>
-        <w:rPr>
-          <w:rFonts w:ascii="Arial" w:hAnsi="Arial" w:cs="Arial"/>
-          <w:sz w:val="20"/>
-          <w:szCs w:val="20"/>
-        </w:rPr>
-        <w:t xml:space="preserve"> para su cotejo</w:t>
-      </w:r>
-      <w:r>
-        <w:rPr>
-          <w:rFonts w:ascii="Arial" w:hAnsi="Arial" w:cs="Arial"/>
-          <w:sz w:val="20"/>
-          <w:szCs w:val="20"/>
-        </w:rPr>
-        <w:t>.</w:t>
+        <w:t xml:space="preserve">, en </w:t>
+      </w:r>
+      <w:sdt>
+        <w:sdtPr>
+          <w:rPr>
+            <w:rFonts w:ascii="Arial" w:hAnsi="Arial" w:cs="Arial"/>
+            <w:sz w:val="20"/>
+            <w:szCs w:val="20"/>
+          </w:rPr>
+          <w:tag w:val="Direccion"/>
+          <w:id w:val="2074810005"/>
+          <w:placeholder>
+            <w:docPart w:val="DefaultPlaceholder_-1854013440"/>
+          </w:placeholder>
+          <w:text/>
+        </w:sdtPr>
+        <w:sdtContent>
+          <w:r>
+            <w:rPr>
+              <w:rFonts w:ascii="Arial" w:hAnsi="Arial" w:cs="Arial"/>
+              <w:sz w:val="20"/>
+              <w:szCs w:val="20"/>
+            </w:rPr>
+            <w:t>[</w:t>
+          </w:r>
+          <w:proofErr w:type="spellStart"/>
+          <w:r>
+            <w:rPr>
+              <w:rFonts w:ascii="Arial" w:hAnsi="Arial" w:cs="Arial"/>
+              <w:sz w:val="20"/>
+              <w:szCs w:val="20"/>
+            </w:rPr>
+            <w:t>Direccion</w:t>
+          </w:r>
+          <w:proofErr w:type="spellEnd"/>
+          <w:r>
+            <w:rPr>
+              <w:rFonts w:ascii="Arial" w:hAnsi="Arial" w:cs="Arial"/>
+              <w:sz w:val="20"/>
+              <w:szCs w:val="20"/>
+            </w:rPr>
+            <w:t>]</w:t>
+          </w:r>
+        </w:sdtContent>
+      </w:sdt>
+      <w:r>
+        <w:rPr>
+          <w:rFonts w:ascii="Arial" w:hAnsi="Arial" w:cs="Arial"/>
+          <w:sz w:val="20"/>
+          <w:szCs w:val="20"/>
+        </w:rPr>
+        <w:t>, para su cotejo.</w:t>
       </w:r>
     </w:p>
     <w:p>
@@ -4131,7 +4109,16 @@
           <w:sz w:val="20"/>
           <w:szCs w:val="20"/>
         </w:rPr>
-        <w:t>Consejo Técnico u Órgano Equivalente</w:t>
+        <w:t xml:space="preserve">Consejo Técnico u Órgano </w:t>
+      </w:r>
+      <w:proofErr w:type="gramStart"/>
+      <w:r>
+        <w:rPr>
+          <w:rFonts w:ascii="Arial" w:hAnsi="Arial" w:cs="Arial"/>
+          <w:sz w:val="20"/>
+          <w:szCs w:val="20"/>
+        </w:rPr>
+        <w:t>Equivalente</w:t>
       </w:r>
       <w:r>
         <w:rPr>
@@ -4141,6 +4128,7 @@
         </w:rPr>
         <w:t>,</w:t>
       </w:r>
+      <w:proofErr w:type="gramEnd"/>
       <w:r>
         <w:rPr>
           <w:rFonts w:ascii="Arial" w:hAnsi="Arial" w:cs="Arial"/>
@@ -5667,6 +5655,7 @@
           <w:szCs w:val="20"/>
           <w:lang w:val="es-ES"/>
         </w:rPr>
+        <w:lastRenderedPageBreak/>
         <w:t>“Lis de Veracruz: Arte, Ciencia, Luz”</w:t>
       </w:r>
     </w:p>
@@ -8560,10 +8549,11 @@
   </w:font>
   <w:font w:name="Gill Sans MT">
     <w:altName w:val="Times New Roman"/>
+    <w:panose1 w:val="020B0502020104020203"/>
     <w:charset w:val="00"/>
     <w:family w:val="swiss"/>
     <w:pitch w:val="variable"/>
-    <w:sig w:usb0="00000003" w:usb1="00000000" w:usb2="00000000" w:usb3="00000000" w:csb0="00000003" w:csb1="00000000"/>
+    <w:sig w:usb0="00000007" w:usb1="00000000" w:usb2="00000000" w:usb3="00000000" w:csb0="00000003" w:csb1="00000000"/>
   </w:font>
   <w:font w:name="Calibri">
     <w:panose1 w:val="020F0502020204030204"/>
@@ -8573,6 +8563,7 @@
     <w:sig w:usb0="E4002EFF" w:usb1="C200247B" w:usb2="00000009" w:usb3="00000000" w:csb0="000001FF" w:csb1="00000000"/>
   </w:font>
   <w:font w:name="MS Mincho">
+    <w:altName w:val="ＭＳ 明朝"/>
     <w:panose1 w:val="02020609040205080304"/>
     <w:charset w:val="80"/>
     <w:family w:val="modern"/>
@@ -8638,8 +8629,10 @@
     <w:rsid w:val="00116312"/>
     <w:rsid w:val="00240534"/>
     <w:rsid w:val="0042343D"/>
+    <w:rsid w:val="006C1374"/>
     <w:rsid w:val="006E6820"/>
     <w:rsid w:val="00812D09"/>
+    <w:rsid w:val="008D02AF"/>
     <w:rsid w:val="008D42D2"/>
     <w:rsid w:val="008F781C"/>
     <w:rsid w:val="009D4F8C"/>
@@ -8647,7 +8640,9 @@
     <w:rsid w:val="00B334A0"/>
     <w:rsid w:val="00C83D0F"/>
     <w:rsid w:val="00D80CC8"/>
+    <w:rsid w:val="00EE05CF"/>
     <w:rsid w:val="00EF3A93"/>
+    <w:rsid w:val="00FB6F7F"/>
   </w:rsids>
   <m:mathPr>
     <m:mathFont m:val="Cambria Math"/>

</xml_diff>